<commit_message>
examples(tula-hakai): move methods to README, add published blog link
Drop the in-post Methods & reproducibility section (now a one-line repo pointer); add the Methods text and the published post URL (blog.openalex.org) to the README and collection index. Regenerated docx.

Co-Authored-By: Claude Opus 4.8 <noreply@anthropic.com>
</commit_message>
<xml_diff>
--- a/plans/awards/examples/tula-hakai-funder-impact/blog/tula-case-study.docx
+++ b/plans/awards/examples/tula-hakai-funder-impact/blog/tula-case-study.docx
@@ -2778,105 +2778,48 @@
         </w:pict>
       </w:r>
     </w:p>
-    <w:bookmarkStart w:id="53" w:name="methods-reproducibility"/>
-    <w:p>
-      <w:pPr>
-        <w:pStyle w:val="Heading3"/>
-      </w:pPr>
-      <w:r>
-        <w:t xml:space="preserve">Methods &amp; reproducibility</w:t>
-      </w:r>
-    </w:p>
     <w:p>
       <w:pPr>
         <w:pStyle w:val="FirstParagraph"/>
       </w:pPr>
       <w:r>
-        <w:t xml:space="preserve">Corpus built from OpenAlex (June 2026) via nine search strategies (funder, affiliation, raw</w:t>
-      </w:r>
-      <w:r>
-        <w:t xml:space="preserve"> </w:t>
-      </w:r>
-      <w:r>
-        <w:t xml:space="preserve">affiliation, full-text, datasets); 1,684 candidates de-duplicated and verified with an LLM plus</w:t>
-      </w:r>
-      <w:r>
-        <w:t xml:space="preserve"> </w:t>
-      </w:r>
-      <w:r>
-        <w:t xml:space="preserve">manual review of all exclusions (170 removed), with a second pass to bring Tula’s marine</w:t>
-      </w:r>
-      <w:r>
-        <w:t xml:space="preserve"> </w:t>
-      </w:r>
-      <w:r>
-        <w:t xml:space="preserve">microbial/protist research into the marine frame. Analysis corpus: 1,496 works — all genuine</w:t>
-      </w:r>
-      <w:r>
-        <w:t xml:space="preserve"> </w:t>
-      </w:r>
-      <w:r>
-        <w:t xml:space="preserve">Tula/Hakai research output except clinical/behavioural papers (Medicine, Psychology, Neuroscience,</w:t>
-      </w:r>
-      <w:r>
-        <w:t xml:space="preserve"> </w:t>
-      </w:r>
-      <w:r>
-        <w:t xml:space="preserve">Health Professions) and a couple of off-topic items, which were set aside. Trend charts run through</w:t>
-      </w:r>
-      <w:r>
-        <w:t xml:space="preserve"> </w:t>
-      </w:r>
-      <w:r>
-        <w:t xml:space="preserve">2025, the last reliably-indexed year; OpenAlex’s 2026 publication-year counts are still inflated by</w:t>
-      </w:r>
-      <w:r>
-        <w:t xml:space="preserve"> </w:t>
-      </w:r>
-      <w:r>
-        <w:t xml:space="preserve">indexing lag, though the corpus totals span 2026. Citation metrics use OpenAlex FWCI and</w:t>
-      </w:r>
-      <w:r>
-        <w:t xml:space="preserve"> </w:t>
-      </w:r>
-      <w:r>
-        <w:t xml:space="preserve">citation-normalized percentiles. Precision is the share of candidates that were genuine; recall is</w:t>
-      </w:r>
-      <w:r>
-        <w:t xml:space="preserve"> </w:t>
-      </w:r>
-      <w:r>
-        <w:t xml:space="preserve">measured against Hakai’s public publication list (356 valid DOIs). Collaboration analysis compares</w:t>
-      </w:r>
-      <w:r>
-        <w:t xml:space="preserve"> </w:t>
-      </w:r>
-      <w:r>
-        <w:t xml:space="preserve">two equal 15-year windows (1994–2008 vs 2010–2024) for five BC universities within Hakai’s coastal</w:t>
-      </w:r>
-      <w:r>
-        <w:t xml:space="preserve"> </w:t>
-      </w:r>
-      <w:r>
-        <w:t xml:space="preserve">topics; co-funding groups the corpus by acknowledged funders; downstream reach aggregates citing</w:t>
-      </w:r>
-      <w:r>
-        <w:t xml:space="preserve"> </w:t>
-      </w:r>
-      <w:r>
-        <w:t xml:space="preserve">works by country and field. The field-influence analysis is associational, not causal. All code,</w:t>
-      </w:r>
-      <w:r>
-        <w:t xml:space="preserve"> </w:t>
-      </w:r>
-      <w:r>
-        <w:t xml:space="preserve">data, and figures are in the project repository.</w:t>
-      </w:r>
-    </w:p>
-    <w:p>
-      <w:pPr>
-        <w:pStyle w:val="BodyText"/>
-      </w:pPr>
+        <w:rPr>
+          <w:i/>
+          <w:iCs/>
+        </w:rPr>
+        <w:t xml:space="preserve">Full methods, code, data, and figures are in the</w:t>
+      </w:r>
+      <w:r>
+        <w:rPr>
+          <w:i/>
+          <w:iCs/>
+        </w:rPr>
+        <w:t xml:space="preserve"> </w:t>
+      </w:r>
+      <w:hyperlink r:id="rId53">
+        <w:r>
+          <w:rPr>
+            <w:rStyle w:val="Hyperlink"/>
+            <w:i/>
+            <w:iCs/>
+          </w:rPr>
+          <w:t xml:space="preserve">project repository</w:t>
+        </w:r>
+      </w:hyperlink>
+      <w:r>
+        <w:rPr>
+          <w:i/>
+          <w:iCs/>
+        </w:rPr>
+        <w:t xml:space="preserve">.</w:t>
+      </w:r>
+      <w:r>
+        <w:rPr>
+          <w:i/>
+          <w:iCs/>
+        </w:rPr>
+        <w:t xml:space="preserve"> </w:t>
+      </w:r>
       <w:r>
         <w:rPr>
           <w:i/>
@@ -2899,7 +2842,6 @@
         <w:t xml:space="preserve">and Mail and The Narwhal.</w:t>
       </w:r>
     </w:p>
-    <w:bookmarkEnd w:id="53"/>
     <w:bookmarkEnd w:id="54"/>
     <w:sectPr>
       <w:footnotePr>

</xml_diff>

<commit_message>
examples(tula-hakai): precision/recall full-search only; drop comparison figure
Post used only the full-search numbers, so simplify 13_precision_recall.py to a single analysis (no funder-only comparison, no figure), remove the figure files, and update the blog note + README accordingly.

Co-Authored-By: Claude Opus 4.8 <noreply@anthropic.com>
</commit_message>
<xml_diff>
--- a/plans/awards/examples/tula-hakai-funder-impact/blog/tula-case-study.docx
+++ b/plans/awards/examples/tula-hakai-funder-impact/blog/tula-case-study.docx
@@ -395,7 +395,7 @@
       </w:r>
     </w:p>
     <w:bookmarkEnd w:id="10"/>
-    <w:bookmarkStart w:id="16" w:name="finding-the-corpus-casting-a-wide-net"/>
+    <w:bookmarkStart w:id="13" w:name="finding-the-corpus-casting-a-wide-net"/>
     <w:p>
       <w:pPr>
         <w:pStyle w:val="Heading2"/>
@@ -721,7 +721,7 @@
         <w:t xml:space="preserve">puns: sorry, I just couldn’t help myself]</w:t>
       </w:r>
     </w:p>
-    <w:bookmarkStart w:id="15" w:name="verifying-every-candidate"/>
+    <w:bookmarkStart w:id="12" w:name="verifying-every-candidate"/>
     <w:p>
       <w:pPr>
         <w:pStyle w:val="Heading3"/>
@@ -854,31 +854,22 @@
         <w:t xml:space="preserve"> </w:t>
       </w:r>
       <w:r>
-        <w:t xml:space="preserve">For those who are interested, I estimated precision and recall</w:t>
-      </w:r>
-      <w:r>
-        <w:t xml:space="preserve"> </w:t>
-      </w:r>
-      <w:r>
-        <w:t xml:space="preserve">of two search strategies: one with just the OpenAlex funder filter and one with all 9 queries</w:t>
-      </w:r>
-      <w:r>
-        <w:t xml:space="preserve"> </w:t>
-      </w:r>
-      <w:r>
-        <w:t xml:space="preserve">combined (full search). Precision was calculated as the number of publications in the final set</w:t>
-      </w:r>
-      <w:r>
-        <w:t xml:space="preserve"> </w:t>
-      </w:r>
-      <w:r>
-        <w:t xml:space="preserve">divided by the total candidates in each strategy, and recall against Hakai’s public list of</w:t>
-      </w:r>
-      <w:r>
-        <w:t xml:space="preserve"> </w:t>
-      </w:r>
-      <w:r>
-        <w:t xml:space="preserve">publications (</w:t>
+        <w:t xml:space="preserve">For those who are interested: precision — the share of</w:t>
+      </w:r>
+      <w:r>
+        <w:t xml:space="preserve"> </w:t>
+      </w:r>
+      <w:r>
+        <w:t xml:space="preserve">candidates that turned out to be genuine — was 90%, and recall — measured against Hakai’s public</w:t>
+      </w:r>
+      <w:r>
+        <w:t xml:space="preserve"> </w:t>
+      </w:r>
+      <w:r>
+        <w:t xml:space="preserve">publication list (356 valid DOIs;</w:t>
+      </w:r>
+      <w:r>
+        <w:t xml:space="preserve"> </w:t>
       </w:r>
       <w:hyperlink r:id="rId11">
         <w:r>
@@ -889,178 +880,111 @@
         </w:r>
       </w:hyperlink>
       <w:r>
-        <w:t xml:space="preserve">). The funder filter alone is slightly more precise</w:t>
-      </w:r>
-      <w:r>
-        <w:t xml:space="preserve"> </w:t>
-      </w:r>
-      <w:r>
-        <w:t xml:space="preserve">(95% vs 90%) but finds less than half of Hakai’s known publications (49% recall); the full search</w:t>
-      </w:r>
-      <w:r>
-        <w:t xml:space="preserve"> </w:t>
-      </w:r>
-      <w:r>
-        <w:t xml:space="preserve">trades a little precision for far better completeness (90% precision, 89% recall). The ~11% the</w:t>
-      </w:r>
-      <w:r>
-        <w:t xml:space="preserve"> </w:t>
-      </w:r>
-      <w:r>
-        <w:t xml:space="preserve">full search still misses are works with no funder acknowledgement, no Hakai affiliation, and no</w:t>
-      </w:r>
-      <w:r>
-        <w:t xml:space="preserve"> </w:t>
-      </w:r>
-      <w:r>
-        <w:t xml:space="preserve">searchable full text — the frontier that direct, funder-asserted linkages are built to close.</w:t>
-      </w:r>
-    </w:p>
-    <w:p>
-      <w:pPr>
-        <w:pStyle w:val="CaptionedFigure"/>
+        <w:t xml:space="preserve">) — was 89%. The ~11% the search</w:t>
+      </w:r>
+      <w:r>
+        <w:t xml:space="preserve"> </w:t>
+      </w:r>
+      <w:r>
+        <w:t xml:space="preserve">misses are works with no funder acknowledgement, no Hakai affiliation, and no searchable full</w:t>
+      </w:r>
+      <w:r>
+        <w:t xml:space="preserve"> </w:t>
+      </w:r>
+      <w:r>
+        <w:t xml:space="preserve">text — the frontier that direct, funder-asserted linkages are built to close.</w:t>
+      </w:r>
+    </w:p>
+    <w:bookmarkEnd w:id="12"/>
+    <w:bookmarkEnd w:id="13"/>
+    <w:bookmarkStart w:id="20" w:name="what-the-funding-produced"/>
+    <w:p>
+      <w:pPr>
+        <w:pStyle w:val="Heading2"/>
+      </w:pPr>
+      <w:r>
+        <w:t xml:space="preserve">What the funding produced</w:t>
+      </w:r>
+    </w:p>
+    <w:p>
+      <w:pPr>
+        <w:pStyle w:val="FirstParagraph"/>
+      </w:pPr>
+      <w:r>
+        <w:t xml:space="preserve">1,496 verified Tula/Hakai research works, spanning effectively 2007 to today, from 4,742 authors</w:t>
+      </w:r>
+      <w:r>
+        <w:t xml:space="preserve"> </w:t>
+      </w:r>
+      <w:r>
+        <w:t xml:space="preserve">at 1,200+ institutions in 85 countries. ~80% are open access. Over 100 are open datasets.</w:t>
+      </w:r>
+    </w:p>
+    <w:p>
+      <w:pPr>
+        <w:pStyle w:val="BodyText"/>
+      </w:pPr>
+      <w:r>
+        <w:t xml:space="preserve">That ~80% open-access share is well above the global average (about 47% of research published</w:t>
+      </w:r>
+      <w:r>
+        <w:t xml:space="preserve"> </w:t>
+      </w:r>
+      <w:r>
+        <w:t xml:space="preserve">2015–2024). That isn’t an accident. In 2015, Hakai adopted an open-science policy (one I helped</w:t>
+      </w:r>
+      <w:r>
+        <w:t xml:space="preserve"> </w:t>
+      </w:r>
+      <w:r>
+        <w:t xml:space="preserve">implement) requiring open data and publications. Funders are one of the most powerful levers for</w:t>
+      </w:r>
+      <w:r>
+        <w:t xml:space="preserve"> </w:t>
+      </w:r>
+      <w:r>
+        <w:t xml:space="preserve">open science: when the Gates Foundation made immediate open access a condition of its grants,</w:t>
+      </w:r>
+      <w:r>
+        <w:t xml:space="preserve"> </w:t>
+      </w:r>
+      <w:r>
+        <w:t xml:space="preserve">compliance followed across the fields it funds and other funders were empowered to make similar</w:t>
+      </w:r>
+      <w:r>
+        <w:t xml:space="preserve"> </w:t>
+      </w:r>
+      <w:r>
+        <w:t xml:space="preserve">policies. Hakai’s policy is a small, early example of the same dynamic, and it shows up directly</w:t>
+      </w:r>
+      <w:r>
+        <w:t xml:space="preserve"> </w:t>
+      </w:r>
+      <w:r>
+        <w:t xml:space="preserve">in how discoverable and reusable this body of work is today.</w:t>
+      </w:r>
+    </w:p>
+    <w:p>
+      <w:pPr>
+        <w:pStyle w:val="BodyText"/>
       </w:pPr>
       <w:r>
         <w:drawing>
           <wp:inline>
-            <wp:extent cx="5334000" cy="3783122"/>
+            <wp:extent cx="5334000" cy="3100920"/>
             <wp:effectExtent b="0" l="0" r="0" t="0"/>
-            <wp:docPr descr="Precision and recall of the funder filter vs. the full search" title="" id="13" name="Picture"/>
+            <wp:docPr descr="Tula/Hakai research outputs per year" title="" id="15" name="Picture"/>
             <a:graphic>
               <a:graphicData uri="http://schemas.openxmlformats.org/drawingml/2006/picture">
                 <pic:pic>
                   <pic:nvPicPr>
-                    <pic:cNvPr descr="../figures/13_precision_recall.png" id="14" name="Picture"/>
+                    <pic:cNvPr descr="../figures/05_works_per_year.png" id="16" name="Picture"/>
                     <pic:cNvPicPr>
                       <a:picLocks noChangeArrowheads="1" noChangeAspect="1"/>
                     </pic:cNvPicPr>
                   </pic:nvPicPr>
                   <pic:blipFill>
-                    <a:blip r:embed="rId12"/>
-                    <a:stretch>
-                      <a:fillRect/>
-                    </a:stretch>
-                  </pic:blipFill>
-                  <pic:spPr bwMode="auto">
-                    <a:xfrm>
-                      <a:off x="0" y="0"/>
-                      <a:ext cx="5334000" cy="3783122"/>
-                    </a:xfrm>
-                    <a:prstGeom prst="rect">
-                      <a:avLst/>
-                    </a:prstGeom>
-                    <a:noFill/>
-                    <a:ln w="9525">
-                      <a:noFill/>
-                      <a:headEnd/>
-                      <a:tailEnd/>
-                    </a:ln>
-                  </pic:spPr>
-                </pic:pic>
-              </a:graphicData>
-            </a:graphic>
-          </wp:inline>
-        </w:drawing>
-      </w:r>
-    </w:p>
-    <w:p>
-      <w:pPr>
-        <w:pStyle w:val="ImageCaption"/>
-      </w:pPr>
-      <w:r>
-        <w:t xml:space="preserve">Precision and recall of the funder filter vs. the full search</w:t>
-      </w:r>
-    </w:p>
-    <w:bookmarkEnd w:id="15"/>
-    <w:bookmarkEnd w:id="16"/>
-    <w:bookmarkStart w:id="23" w:name="what-the-funding-produced"/>
-    <w:p>
-      <w:pPr>
-        <w:pStyle w:val="Heading2"/>
-      </w:pPr>
-      <w:r>
-        <w:t xml:space="preserve">What the funding produced</w:t>
-      </w:r>
-    </w:p>
-    <w:p>
-      <w:pPr>
-        <w:pStyle w:val="FirstParagraph"/>
-      </w:pPr>
-      <w:r>
-        <w:t xml:space="preserve">1,496 verified Tula/Hakai research works, spanning effectively 2007 to today, from 4,742 authors</w:t>
-      </w:r>
-      <w:r>
-        <w:t xml:space="preserve"> </w:t>
-      </w:r>
-      <w:r>
-        <w:t xml:space="preserve">at 1,200+ institutions in 85 countries. ~80% are open access. Over 100 are open datasets.</w:t>
-      </w:r>
-    </w:p>
-    <w:p>
-      <w:pPr>
-        <w:pStyle w:val="BodyText"/>
-      </w:pPr>
-      <w:r>
-        <w:t xml:space="preserve">That ~80% open-access share is well above the global average (about 47% of research published</w:t>
-      </w:r>
-      <w:r>
-        <w:t xml:space="preserve"> </w:t>
-      </w:r>
-      <w:r>
-        <w:t xml:space="preserve">2015–2024). That isn’t an accident. In 2015, Hakai adopted an open-science policy (one I helped</w:t>
-      </w:r>
-      <w:r>
-        <w:t xml:space="preserve"> </w:t>
-      </w:r>
-      <w:r>
-        <w:t xml:space="preserve">implement) requiring open data and publications. Funders are one of the most powerful levers for</w:t>
-      </w:r>
-      <w:r>
-        <w:t xml:space="preserve"> </w:t>
-      </w:r>
-      <w:r>
-        <w:t xml:space="preserve">open science: when the Gates Foundation made immediate open access a condition of its grants,</w:t>
-      </w:r>
-      <w:r>
-        <w:t xml:space="preserve"> </w:t>
-      </w:r>
-      <w:r>
-        <w:t xml:space="preserve">compliance followed across the fields it funds and other funders were empowered to make similar</w:t>
-      </w:r>
-      <w:r>
-        <w:t xml:space="preserve"> </w:t>
-      </w:r>
-      <w:r>
-        <w:t xml:space="preserve">policies. Hakai’s policy is a small, early example of the same dynamic, and it shows up directly</w:t>
-      </w:r>
-      <w:r>
-        <w:t xml:space="preserve"> </w:t>
-      </w:r>
-      <w:r>
-        <w:t xml:space="preserve">in how discoverable and reusable this body of work is today.</w:t>
-      </w:r>
-    </w:p>
-    <w:p>
-      <w:pPr>
-        <w:pStyle w:val="BodyText"/>
-      </w:pPr>
-      <w:r>
-        <w:drawing>
-          <wp:inline>
-            <wp:extent cx="5334000" cy="3100920"/>
-            <wp:effectExtent b="0" l="0" r="0" t="0"/>
-            <wp:docPr descr="Tula/Hakai research outputs per year" title="" id="18" name="Picture"/>
-            <a:graphic>
-              <a:graphicData uri="http://schemas.openxmlformats.org/drawingml/2006/picture">
-                <pic:pic>
-                  <pic:nvPicPr>
-                    <pic:cNvPr descr="../figures/05_works_per_year.png" id="19" name="Picture"/>
-                    <pic:cNvPicPr>
-                      <a:picLocks noChangeArrowheads="1" noChangeAspect="1"/>
-                    </pic:cNvPicPr>
-                  </pic:nvPicPr>
-                  <pic:blipFill>
-                    <a:blip r:embed="rId17"/>
+                    <a:blip r:embed="rId14"/>
                     <a:stretch>
                       <a:fillRect/>
                     </a:stretch>
@@ -1146,18 +1070,18 @@
           <wp:inline>
             <wp:extent cx="5334000" cy="3001446"/>
             <wp:effectExtent b="0" l="0" r="0" t="0"/>
-            <wp:docPr descr="Subfields of the corpus" title="" id="21" name="Picture"/>
+            <wp:docPr descr="Subfields of the corpus" title="" id="18" name="Picture"/>
             <a:graphic>
               <a:graphicData uri="http://schemas.openxmlformats.org/drawingml/2006/picture">
                 <pic:pic>
                   <pic:nvPicPr>
-                    <pic:cNvPr descr="../figures/05_subfields_donut.png" id="22" name="Picture"/>
+                    <pic:cNvPr descr="../figures/05_subfields_donut.png" id="19" name="Picture"/>
                     <pic:cNvPicPr>
                       <a:picLocks noChangeArrowheads="1" noChangeAspect="1"/>
                     </pic:cNvPicPr>
                   </pic:nvPicPr>
                   <pic:blipFill>
-                    <a:blip r:embed="rId20"/>
+                    <a:blip r:embed="rId17"/>
                     <a:stretch>
                       <a:fillRect/>
                     </a:stretch>
@@ -1215,8 +1139,8 @@
         <w:t xml:space="preserve">).</w:t>
       </w:r>
     </w:p>
-    <w:bookmarkEnd w:id="23"/>
-    <w:bookmarkStart w:id="27" w:name="citations-punching-above-weight"/>
+    <w:bookmarkEnd w:id="20"/>
+    <w:bookmarkStart w:id="24" w:name="citations-punching-above-weight"/>
     <w:p>
       <w:pPr>
         <w:pStyle w:val="Heading2"/>
@@ -1358,18 +1282,18 @@
           <wp:inline>
             <wp:extent cx="5334000" cy="3611199"/>
             <wp:effectExtent b="0" l="0" r="0" t="0"/>
-            <wp:docPr descr="Share of works in the most-cited percentiles" title="" id="25" name="Picture"/>
+            <wp:docPr descr="Share of works in the most-cited percentiles" title="" id="22" name="Picture"/>
             <a:graphic>
               <a:graphicData uri="http://schemas.openxmlformats.org/drawingml/2006/picture">
                 <pic:pic>
                   <pic:nvPicPr>
-                    <pic:cNvPr descr="../figures/06_percentile_share.png" id="26" name="Picture"/>
+                    <pic:cNvPr descr="../figures/06_percentile_share.png" id="23" name="Picture"/>
                     <pic:cNvPicPr>
                       <a:picLocks noChangeArrowheads="1" noChangeAspect="1"/>
                     </pic:cNvPicPr>
                   </pic:nvPicPr>
                   <pic:blipFill>
-                    <a:blip r:embed="rId24"/>
+                    <a:blip r:embed="rId21"/>
                     <a:stretch>
                       <a:fillRect/>
                     </a:stretch>
@@ -1406,8 +1330,8 @@
         <w:t xml:space="preserve">The corpus is ~6× over-represented in the world’s top 1%, and ~3.5× in the top 10%.</w:t>
       </w:r>
     </w:p>
-    <w:bookmarkEnd w:id="27"/>
-    <w:bookmarkStart w:id="28" w:name="what-was-the-science"/>
+    <w:bookmarkEnd w:id="24"/>
+    <w:bookmarkStart w:id="25" w:name="what-was-the-science"/>
     <w:p>
       <w:pPr>
         <w:pStyle w:val="Heading2"/>
@@ -1751,8 +1675,8 @@
         <w:t xml:space="preserve">The point: the impact numbers aren’t abstract. They’re footprints, sea stars, and kelp.</w:t>
       </w:r>
     </w:p>
-    <w:bookmarkEnd w:id="28"/>
-    <w:bookmarkStart w:id="35" w:name="how-far-does-the-work-travel"/>
+    <w:bookmarkEnd w:id="25"/>
+    <w:bookmarkStart w:id="32" w:name="how-far-does-the-work-travel"/>
     <w:p>
       <w:pPr>
         <w:pStyle w:val="Heading2"/>
@@ -1804,18 +1728,18 @@
           <wp:inline>
             <wp:extent cx="5334000" cy="2525701"/>
             <wp:effectExtent b="0" l="0" r="0" t="0"/>
-            <wp:docPr descr="Where the research is cited — all 199 countries" title="" id="30" name="Picture"/>
+            <wp:docPr descr="Where the research is cited — all 199 countries" title="" id="27" name="Picture"/>
             <a:graphic>
               <a:graphicData uri="http://schemas.openxmlformats.org/drawingml/2006/picture">
                 <pic:pic>
                   <pic:nvPicPr>
-                    <pic:cNvPr descr="../figures/09_citing_map.png" id="31" name="Picture"/>
+                    <pic:cNvPr descr="../figures/09_citing_map.png" id="28" name="Picture"/>
                     <pic:cNvPicPr>
                       <a:picLocks noChangeArrowheads="1" noChangeAspect="1"/>
                     </pic:cNvPicPr>
                   </pic:nvPicPr>
                   <pic:blipFill>
-                    <a:blip r:embed="rId29"/>
+                    <a:blip r:embed="rId26"/>
                     <a:stretch>
                       <a:fillRect/>
                     </a:stretch>
@@ -1861,18 +1785,18 @@
           <wp:inline>
             <wp:extent cx="5334000" cy="2970405"/>
             <wp:effectExtent b="0" l="0" r="0" t="0"/>
-            <wp:docPr descr="Fields that cite the work" title="" id="33" name="Picture"/>
+            <wp:docPr descr="Fields that cite the work" title="" id="30" name="Picture"/>
             <a:graphic>
               <a:graphicData uri="http://schemas.openxmlformats.org/drawingml/2006/picture">
                 <pic:pic>
                   <pic:nvPicPr>
-                    <pic:cNvPr descr="../figures/09_citing_fields_donut.png" id="34" name="Picture"/>
+                    <pic:cNvPr descr="../figures/09_citing_fields_donut.png" id="31" name="Picture"/>
                     <pic:cNvPicPr>
                       <a:picLocks noChangeArrowheads="1" noChangeAspect="1"/>
                     </pic:cNvPicPr>
                   </pic:nvPicPr>
                   <pic:blipFill>
-                    <a:blip r:embed="rId32"/>
+                    <a:blip r:embed="rId29"/>
                     <a:stretch>
                       <a:fillRect/>
                     </a:stretch>
@@ -1907,8 +1831,8 @@
         <w:t xml:space="preserve">Fields that cite the work</w:t>
       </w:r>
     </w:p>
-    <w:bookmarkEnd w:id="35"/>
-    <w:bookmarkStart w:id="39" w:name="breaking-the-silos"/>
+    <w:bookmarkEnd w:id="32"/>
+    <w:bookmarkStart w:id="36" w:name="breaking-the-silos"/>
     <w:p>
       <w:pPr>
         <w:pStyle w:val="Heading2"/>
@@ -2022,18 +1946,18 @@
           <wp:inline>
             <wp:extent cx="5334000" cy="2678011"/>
             <wp:effectExtent b="0" l="0" r="0" t="0"/>
-            <wp:docPr descr="Collaboration network before and after the field station" title="" id="37" name="Picture"/>
+            <wp:docPr descr="Collaboration network before and after the field station" title="" id="34" name="Picture"/>
             <a:graphic>
               <a:graphicData uri="http://schemas.openxmlformats.org/drawingml/2006/picture">
                 <pic:pic>
                   <pic:nvPicPr>
-                    <pic:cNvPr descr="../figures/08_network_before_after.png" id="38" name="Picture"/>
+                    <pic:cNvPr descr="../figures/08_network_before_after.png" id="35" name="Picture"/>
                     <pic:cNvPicPr>
                       <a:picLocks noChangeArrowheads="1" noChangeAspect="1"/>
                     </pic:cNvPicPr>
                   </pic:nvPicPr>
                   <pic:blipFill>
-                    <a:blip r:embed="rId36"/>
+                    <a:blip r:embed="rId33"/>
                     <a:stretch>
                       <a:fillRect/>
                     </a:stretch>
@@ -2098,8 +2022,8 @@
         <w:t xml:space="preserve">afterward (right) the ties thicken dramatically.</w:t>
       </w:r>
     </w:p>
-    <w:bookmarkEnd w:id="39"/>
-    <w:bookmarkStart w:id="43" w:name="amplifying-other-funders-investments"/>
+    <w:bookmarkEnd w:id="36"/>
+    <w:bookmarkStart w:id="40" w:name="amplifying-other-funders-investments"/>
     <w:p>
       <w:pPr>
         <w:pStyle w:val="Heading2"/>
@@ -2137,18 +2061,18 @@
           <wp:inline>
             <wp:extent cx="5334000" cy="2534867"/>
             <wp:effectExtent b="0" l="0" r="0" t="0"/>
-            <wp:docPr descr="Top co-funders" title="" id="41" name="Picture"/>
+            <wp:docPr descr="Top co-funders" title="" id="38" name="Picture"/>
             <a:graphic>
               <a:graphicData uri="http://schemas.openxmlformats.org/drawingml/2006/picture">
                 <pic:pic>
                   <pic:nvPicPr>
-                    <pic:cNvPr descr="../figures/11_cofunders.png" id="42" name="Picture"/>
+                    <pic:cNvPr descr="../figures/11_cofunders.png" id="39" name="Picture"/>
                     <pic:cNvPicPr>
                       <a:picLocks noChangeArrowheads="1" noChangeAspect="1"/>
                     </pic:cNvPicPr>
                   </pic:nvPicPr>
                   <pic:blipFill>
-                    <a:blip r:embed="rId40"/>
+                    <a:blip r:embed="rId37"/>
                     <a:stretch>
                       <a:fillRect/>
                     </a:stretch>
@@ -2253,8 +2177,8 @@
         <w:t xml:space="preserve">and show, that amplifying effect directly.</w:t>
       </w:r>
     </w:p>
-    <w:bookmarkEnd w:id="43"/>
-    <w:bookmarkStart w:id="47" w:name="what-bibliometrics-can-and-cant-tell-you"/>
+    <w:bookmarkEnd w:id="40"/>
+    <w:bookmarkStart w:id="44" w:name="what-bibliometrics-can-and-cant-tell-you"/>
     <w:p>
       <w:pPr>
         <w:pStyle w:val="Heading2"/>
@@ -2348,18 +2272,18 @@
           <wp:inline>
             <wp:extent cx="5334000" cy="3394561"/>
             <wp:effectExtent b="0" l="0" r="0" t="0"/>
-            <wp:docPr descr="BC’s specialization in Hakai topics" title="" id="45" name="Picture"/>
+            <wp:docPr descr="BC’s specialization in Hakai topics" title="" id="42" name="Picture"/>
             <a:graphic>
               <a:graphicData uri="http://schemas.openxmlformats.org/drawingml/2006/picture">
                 <pic:pic>
                   <pic:nvPicPr>
-                    <pic:cNvPr descr="../figures/07_specialization.png" id="46" name="Picture"/>
+                    <pic:cNvPr descr="../figures/07_specialization.png" id="43" name="Picture"/>
                     <pic:cNvPicPr>
                       <a:picLocks noChangeArrowheads="1" noChangeAspect="1"/>
                     </pic:cNvPicPr>
                   </pic:nvPicPr>
                   <pic:blipFill>
-                    <a:blip r:embed="rId44"/>
+                    <a:blip r:embed="rId41"/>
                     <a:stretch>
                       <a:fillRect/>
                     </a:stretch>
@@ -2468,8 +2392,8 @@
         <w:t xml:space="preserve">something any funder can do.</w:t>
       </w:r>
     </w:p>
-    <w:bookmarkEnd w:id="47"/>
-    <w:bookmarkStart w:id="48" w:name="the-part-the-bibliometrics-miss"/>
+    <w:bookmarkEnd w:id="44"/>
+    <w:bookmarkStart w:id="45" w:name="the-part-the-bibliometrics-miss"/>
     <w:p>
       <w:pPr>
         <w:pStyle w:val="Heading2"/>
@@ -2534,8 +2458,8 @@
         <w:t xml:space="preserve">figure.</w:t>
       </w:r>
     </w:p>
-    <w:bookmarkEnd w:id="48"/>
-    <w:bookmarkStart w:id="52" w:name="careers-including-mine"/>
+    <w:bookmarkEnd w:id="45"/>
+    <w:bookmarkStart w:id="49" w:name="careers-including-mine"/>
     <w:p>
       <w:pPr>
         <w:pStyle w:val="Heading2"/>
@@ -2617,18 +2541,18 @@
           <wp:inline>
             <wp:extent cx="5334000" cy="3186717"/>
             <wp:effectExtent b="0" l="0" r="0" t="0"/>
-            <wp:docPr descr="The sea-otter and kelp research lineage" title="" id="50" name="Picture"/>
+            <wp:docPr descr="The sea-otter and kelp research lineage" title="" id="47" name="Picture"/>
             <a:graphic>
               <a:graphicData uri="http://schemas.openxmlformats.org/drawingml/2006/picture">
                 <pic:pic>
                   <pic:nvPicPr>
-                    <pic:cNvPr descr="../figures/10_otter_kelp_lineage.png" id="51" name="Picture"/>
+                    <pic:cNvPr descr="../figures/10_otter_kelp_lineage.png" id="48" name="Picture"/>
                     <pic:cNvPicPr>
                       <a:picLocks noChangeArrowheads="1" noChangeAspect="1"/>
                     </pic:cNvPicPr>
                   </pic:nvPicPr>
                   <pic:blipFill>
-                    <a:blip r:embed="rId49"/>
+                    <a:blip r:embed="rId46"/>
                     <a:stretch>
                       <a:fillRect/>
                     </a:stretch>
@@ -2683,8 +2607,8 @@
         <w:t xml:space="preserve">of a faculty office. A funder’s impact includes the careers it shapes, including my own.</w:t>
       </w:r>
     </w:p>
-    <w:bookmarkEnd w:id="52"/>
-    <w:bookmarkStart w:id="54" w:name="X25adac724b555ecf02d45310eb3d43f44eeb0a7"/>
+    <w:bookmarkEnd w:id="49"/>
+    <w:bookmarkStart w:id="51" w:name="X25adac724b555ecf02d45310eb3d43f44eeb0a7"/>
     <w:p>
       <w:pPr>
         <w:pStyle w:val="Heading2"/>
@@ -2796,7 +2720,7 @@
         </w:rPr>
         <w:t xml:space="preserve"> </w:t>
       </w:r>
-      <w:hyperlink r:id="rId53">
+      <w:hyperlink r:id="rId50">
         <w:r>
           <w:rPr>
             <w:rStyle w:val="Hyperlink"/>
@@ -2842,7 +2766,7 @@
         <w:t xml:space="preserve">and Mail and The Narwhal.</w:t>
       </w:r>
     </w:p>
-    <w:bookmarkEnd w:id="54"/>
+    <w:bookmarkEnd w:id="51"/>
     <w:sectPr>
       <w:footnotePr>
         <w:numRestart w:val="eachSect"/>

</xml_diff>